<commit_message>
fix: hapus teks literal "Hari/Bulan/Tahun" dobel di kotak IV. LAMANYA CUTI (template PNS)
User liat "2 Hari Hari/Bulan/Tahun" di dokumen cetak - macro
\${LAMA_CUTI} (kode udah nempelin satuan asli, "2 Hari") ketiban teks
literal " Hari/Bulan/Tahun" yang emang masih nempel di templatenya
sendiri sejak awal. Splice XML mentah (skill docx-template-merge):
kosongin teks " Hari"/"/Bulan/"/"Tahun" yang nempel di macro run &
2 run sesudahnya, struktur run/rPr dibiarin utuh. Template PPPK udah
bener dari awal (cuma \${LAMA_CUTI} doang, gak ada teks nempel).

Diverifikasi render: sekarang "2 Hari" doang, gak dobel, tetap 1
halaman F4.

Co-Authored-By: Claude Sonnet 5 <noreply@anthropic.com>
Claude-Session: https://claude.ai/code/session_01HWPtYWpZqG3VqT69qtJFS1
</commit_message>
<xml_diff>
--- a/templates/cuti_pns.docx
+++ b/templates/cuti_pns.docx
@@ -1232,14 +1232,14 @@
                 <w:rFonts w:ascii="Arial Narrow" w:hAnsi="Arial Narrow" w:cs="Arial"/>
                 <w:b/>
               </w:rPr>
-              <w:t>${LAMA_CUTI} Hari</w:t>
-            </w:r>
-            <w:r>
-              <w:rPr>
-                <w:rFonts w:ascii="Arial Narrow" w:hAnsi="Arial Narrow" w:cs="Arial"/>
-                <w:b/>
-              </w:rPr>
-              <w:t>/Bulan/</w:t>
+              <w:t>${LAMA_CUTI}</w:t>
+            </w:r>
+            <w:r>
+              <w:rPr>
+                <w:rFonts w:ascii="Arial Narrow" w:hAnsi="Arial Narrow" w:cs="Arial"/>
+                <w:b/>
+              </w:rPr>
+              <w:t/>
             </w:r>
             <w:proofErr w:type="spellStart"/>
             <w:r>
@@ -1247,7 +1247,7 @@
                 <w:rFonts w:ascii="Arial Narrow" w:hAnsi="Arial Narrow" w:cs="Arial"/>
                 <w:b/>
               </w:rPr>
-              <w:t>Tahun</w:t>
+              <w:t/>
             </w:r>
             <w:proofErr w:type="spellEnd"/>
           </w:p>

</xml_diff>